<commit_message>
login and db fix
</commit_message>
<xml_diff>
--- a/public/template/REFC-RelatorioEstatisticoeFinanceirodoCulto.docx
+++ b/public/template/REFC-RelatorioEstatisticoeFinanceirodoCulto.docx
@@ -27,8 +27,8 @@
         <w:gridCol w:w="292"/>
         <w:gridCol w:w="120"/>
         <w:gridCol w:w="769"/>
-        <w:gridCol w:w="518"/>
-        <w:gridCol w:w="122"/>
+        <w:gridCol w:w="258"/>
+        <w:gridCol w:w="382"/>
         <w:gridCol w:w="129"/>
         <w:gridCol w:w="789"/>
         <w:gridCol w:w="20"/>
@@ -233,7 +233,7 @@
         </w:tc>
         <w:tc>
           <w:tcPr>
-            <w:tcW w:w="5156" w:type="dxa"/>
+            <w:tcW w:w="4896" w:type="dxa"/>
             <w:gridSpan w:val="10"/>
             <w:tcBorders>
               <w:top w:val="single" w:sz="12" w:space="0" w:color="000000"/>
@@ -274,7 +274,7 @@
         </w:tc>
         <w:tc>
           <w:tcPr>
-            <w:tcW w:w="1561" w:type="dxa"/>
+            <w:tcW w:w="1821" w:type="dxa"/>
             <w:gridSpan w:val="6"/>
             <w:tcBorders>
               <w:top w:val="single" w:sz="12" w:space="0" w:color="000000"/>
@@ -360,7 +360,7 @@
         </w:trPr>
         <w:tc>
           <w:tcPr>
-            <w:tcW w:w="7085" w:type="dxa"/>
+            <w:tcW w:w="6825" w:type="dxa"/>
             <w:gridSpan w:val="12"/>
             <w:tcBorders>
               <w:top w:val="single" w:sz="12" w:space="0" w:color="000000"/>
@@ -387,7 +387,7 @@
         </w:tc>
         <w:tc>
           <w:tcPr>
-            <w:tcW w:w="3074" w:type="dxa"/>
+            <w:tcW w:w="3334" w:type="dxa"/>
             <w:gridSpan w:val="8"/>
             <w:tcBorders>
               <w:top w:val="single" w:sz="12" w:space="0" w:color="000000"/>
@@ -532,7 +532,7 @@
           <w:p>
             <w:pPr>
               <w:pStyle w:val="Normal"/>
-              <w:jc w:val="center"/>
+              <w:jc w:val="left"/>
               <w:rPr/>
             </w:pPr>
             <w:r>
@@ -584,7 +584,7 @@
           <w:p>
             <w:pPr>
               <w:pStyle w:val="Normal"/>
-              <w:jc w:val="center"/>
+              <w:jc w:val="left"/>
               <w:rPr/>
             </w:pPr>
             <w:r>
@@ -684,7 +684,7 @@
           <w:p>
             <w:pPr>
               <w:pStyle w:val="Normal"/>
-              <w:jc w:val="center"/>
+              <w:jc w:val="left"/>
               <w:rPr/>
             </w:pPr>
             <w:r>
@@ -736,7 +736,7 @@
           <w:p>
             <w:pPr>
               <w:pStyle w:val="Normal"/>
-              <w:jc w:val="center"/>
+              <w:jc w:val="left"/>
               <w:rPr/>
             </w:pPr>
             <w:r>
@@ -843,7 +843,7 @@
           <w:p>
             <w:pPr>
               <w:pStyle w:val="Normal"/>
-              <w:jc w:val="center"/>
+              <w:jc w:val="left"/>
               <w:rPr/>
             </w:pPr>
             <w:r>
@@ -895,7 +895,7 @@
           <w:p>
             <w:pPr>
               <w:pStyle w:val="Normal"/>
-              <w:jc w:val="center"/>
+              <w:jc w:val="left"/>
               <w:rPr/>
             </w:pPr>
             <w:r>

</xml_diff>